<commit_message>
docs: corregir maquetación del diagrama final
</commit_message>
<xml_diff>
--- a/docs/Informe_Final_Fase3_UeesTask.docx
+++ b/docs/Informe_Final_Fase3_UeesTask.docx
@@ -1926,16 +1926,22 @@
     <w:p>
       <w:pPr>
         <w:pStyle w:val="Heading3"/>
+        <w:keepNext/>
+        <w:spacing w:after="0"/>
       </w:pPr>
       <w:r>
         <w:t>Diagrama C - Modelo final de la aplicacion web (HEAD actual)</w:t>
       </w:r>
     </w:p>
     <w:p>
+      <w:pPr>
+        <w:keepLines/>
+        <w:spacing w:before="0" w:after="0"/>
+      </w:pPr>
       <w:r>
         <w:drawing>
           <wp:inline xmlns:a="http://schemas.openxmlformats.org/drawingml/2006/main" xmlns:pic="http://schemas.openxmlformats.org/drawingml/2006/picture">
-            <wp:extent cx="5669280" cy="8402683"/>
+            <wp:extent cx="5215737" cy="7730468"/>
             <wp:docPr id="3" name="Picture 3"/>
             <wp:cNvGraphicFramePr>
               <a:graphicFrameLocks noChangeAspect="1"/>
@@ -1956,7 +1962,7 @@
                   <pic:spPr>
                     <a:xfrm>
                       <a:off x="0" y="0"/>
-                      <a:ext cx="5669280" cy="8402683"/>
+                      <a:ext cx="5215737" cy="7730468"/>
                     </a:xfrm>
                     <a:prstGeom prst="rect"/>
                   </pic:spPr>

</xml_diff>